<commit_message>
Revise edge-cloud doc per review: new privacy/savings images, drop tips and rollout sections
Swap the chapter-opener images for the three supplied illustrations, reword
the privacy intro so savings and privacy read as equally important, describe
the industry architectures generically instead of "copying homework", and
remove the "四条提醒" and "怎么落地、怎么验收" sections.

Co-Authored-By: Claude Fable 5.1 <noreply@anthropic.com>
Claude-Session: https://claude.ai/code/session_012KSWaSiiD51rbsezHM1Rzs
</commit_message>
<xml_diff>
--- a/docs/edge_cloud_savings/别让每个Token都上云：端云协同的省钱与隐私计划（隐私-省钱-架构版）.docx
+++ b/docs/edge_cloud_savings/别让每个Token都上云：端云协同的省钱与隐私计划（隐私-省钱-架构版）.docx
@@ -36,7 +36,7 @@
           <w:b w:val="1"/>
           <w:color w:val="1E6FD9"/>
         </w:rPr>
-        <w:t xml:space="preserve">花十分钟读完，你会🉐到三件事：第一章，数据不出门是怎么做到的，你在哪里能看见它，以及为什么这事比省钱还靠前；第二章，云端账单到底能省多少；第三章，这套东西长什么样，照着谁搭。</w:t>
+        <w:t xml:space="preserve">花十分钟读完，你会🉐到三件事：第一章，数据不出门是怎么做到的，你在哪里能看见它，以及为什么这事比省钱还靠前；第二章，云端账单到底能省多少；第三章，这套东西长什么样。</w:t>
       </w:r>
     </w:p>
     <w:tbl>
@@ -293,29 +293,6 @@
               <w:tabs>
                 <w:tab w:val="right" w:leader="dot" w:pos="13965"/>
               </w:tabs>
-              <w:spacing w:before="40" w:after="40"/>
-              <w:ind w:left="480"/>
-            </w:pPr>
-            <w:r>
-              <w:rPr>
-                <w:color w:val="5A6070"/>
-                <w:sz w:val="20"/>
-                <w:szCs w:val="20"/>
-              </w:rPr>
-              <w:t xml:space="preserve">2.5 别被数字忽悠：四条提醒</w:t>
-            </w:r>
-            <w:r>
-              <w:rPr>
-                <w:color w:val="C0C4CC"/>
-              </w:rPr>
-              <w:tab/>
-            </w:r>
-          </w:p>
-          <w:p>
-            <w:pPr>
-              <w:tabs>
-                <w:tab w:val="right" w:leader="dot" w:pos="13965"/>
-              </w:tabs>
               <w:spacing w:before="140" w:after="60"/>
             </w:pPr>
             <w:r>
@@ -348,7 +325,7 @@
                 <w:sz w:val="20"/>
                 <w:szCs w:val="20"/>
               </w:rPr>
-              <w:t xml:space="preserve">3.1 抄谁的作业：Perplexity 管「家」，Switchyard 管「路」</w:t>
+              <w:t xml:space="preserve">3.1 业界方案长得都差不多：一个管「家」，一个管「路」</w:t>
             </w:r>
             <w:r>
               <w:rPr>
@@ -408,16 +385,16 @@
               <w:tabs>
                 <w:tab w:val="right" w:leader="dot" w:pos="13965"/>
               </w:tabs>
-              <w:spacing w:before="40" w:after="40"/>
-              <w:ind w:left="480"/>
-            </w:pPr>
-            <w:r>
-              <w:rPr>
-                <w:color w:val="5A6070"/>
-                <w:sz w:val="20"/>
-                <w:szCs w:val="20"/>
-              </w:rPr>
-              <w:t xml:space="preserve">3.4 怎么落地、怎么验收</w:t>
+              <w:spacing w:before="140" w:after="60"/>
+            </w:pPr>
+            <w:r>
+              <w:rPr>
+                <w:b w:val="1"/>
+                <w:i w:val="1"/>
+                <w:sz w:val="22"/>
+                <w:szCs w:val="22"/>
+              </w:rPr>
+              <w:t xml:space="preserve">结论：让云端更贵重，而不是更常驻</w:t>
             </w:r>
             <w:r>
               <w:rPr>
@@ -440,7 +417,7 @@
                 <w:sz w:val="22"/>
                 <w:szCs w:val="22"/>
               </w:rPr>
-              <w:t xml:space="preserve">结论：让云端更贵重，而不是更常驻</w:t>
+              <w:t xml:space="preserve">附一：分场景完整数据</w:t>
             </w:r>
             <w:r>
               <w:rPr>
@@ -463,29 +440,6 @@
                 <w:sz w:val="22"/>
                 <w:szCs w:val="22"/>
               </w:rPr>
-              <w:t xml:space="preserve">附一：分场景完整数据</w:t>
-            </w:r>
-            <w:r>
-              <w:rPr>
-                <w:color w:val="C0C4CC"/>
-              </w:rPr>
-              <w:tab/>
-            </w:r>
-          </w:p>
-          <w:p>
-            <w:pPr>
-              <w:tabs>
-                <w:tab w:val="right" w:leader="dot" w:pos="13965"/>
-              </w:tabs>
-              <w:spacing w:before="140" w:after="60"/>
-            </w:pPr>
-            <w:r>
-              <w:rPr>
-                <w:b w:val="1"/>
-                <w:i w:val="1"/>
-                <w:sz w:val="22"/>
-                <w:szCs w:val="22"/>
-              </w:rPr>
               <w:t xml:space="preserve">附二：数据来源</w:t>
             </w:r>
             <w:r>
@@ -521,9 +475,9 @@
       <w:r>
         <w:drawing>
           <wp:inline distT="0" distB="0" distL="0" distR="0">
-            <wp:extent cx="2377440" cy="2233040"/>
+            <wp:extent cx="2377440" cy="2384232"/>
             <wp:effectExtent l="0" t="0" r="0" b="0"/>
-            <wp:docPr id="1" name="meme_all.png"/>
+            <wp:docPr id="1" name="priv_leak.png"/>
             <wp:cNvGraphicFramePr>
               <a:graphicFrameLocks xmlns:a="http://schemas.openxmlformats.org/drawingml/2006/main" noChangeAspect="1"/>
             </wp:cNvGraphicFramePr>
@@ -531,7 +485,7 @@
               <a:graphicData uri="http://schemas.openxmlformats.org/drawingml/2006/picture">
                 <pic:pic xmlns:pic="http://schemas.openxmlformats.org/drawingml/2006/picture">
                   <pic:nvPicPr>
-                    <pic:cNvPr id="1" name="meme_all.png"/>
+                    <pic:cNvPr id="1" name="priv_leak.png"/>
                     <pic:cNvPicPr/>
                   </pic:nvPicPr>
                   <pic:blipFill>
@@ -543,7 +497,7 @@
                   <pic:spPr>
                     <a:xfrm>
                       <a:off x="0" y="0"/>
-                      <a:ext cx="2377440" cy="2233040"/>
+                      <a:ext cx="2377440" cy="2384232"/>
                     </a:xfrm>
                     <a:prstGeom prst="rect">
                       <a:avLst/>
@@ -561,16 +515,16 @@
         <w:spacing w:before="0" w:after="160"/>
       </w:pPr>
       <w:r>
-        <w:t xml:space="preserve">很多人一听「端云协同」，第一反应是省钱。其实顺序反了：</w:t>
+        <w:t xml:space="preserve">很多人一听「端云协同」，第一反应是省钱。其实同样重要的还有隐私：</w:t>
       </w:r>
       <w:r>
         <w:rPr>
           <w:b w:val="1"/>
         </w:rPr>
-        <w:t xml:space="preserve">先是数据不出门，然后才谈账单。</w:t>
-      </w:r>
-      <w:r>
-        <w:t xml:space="preserve"> 省钱是加分项，隐私是准入门槛。省钱和隐私也不用二选一，这一章先讲怎么把门守住。</w:t>
+        <w:t xml:space="preserve">数据不出门，才敢把活儿交给 AI。</w:t>
+      </w:r>
+      <w:r>
+        <w:t xml:space="preserve"> 省钱和隐私不用二选一，这一章先讲怎么把门守住。</w:t>
       </w:r>
     </w:p>
     <w:p>
@@ -687,220 +641,15 @@
     </w:p>
     <w:p>
       <w:pPr>
-        <w:spacing w:before="0" w:after="160"/>
-      </w:pPr>
-      <w:r>
-        <w:t xml:space="preserve">只在系统提示里写一句「请注意隐私」，就像在门口贴张纸条「贵重物品请勿带出」。有礼貌，没用。我们要的是真的会关上的门。整套做法用三个词就能记住：</w:t>
-      </w:r>
-    </w:p>
-    <w:p>
-      <w:pPr>
-        <w:spacing w:before="0" w:after="160"/>
-      </w:pPr>
-      <w:r>
-        <w:rPr>
-          <w:b w:val="1"/>
-        </w:rPr>
-        <w:t xml:space="preserve">一道门。</w:t>
-      </w:r>
-      <w:r>
-        <w:t xml:space="preserve"> 整台盒子默认零出网，只留一个网络出口，而且只有 Agent 内置的「出网门控」能走这个口。任何工具、任何沙箱都不能自己联网。想出门，只能过门控。</w:t>
-      </w:r>
-    </w:p>
-    <w:p>
-      <w:pPr>
-        <w:spacing w:before="0" w:after="160"/>
-      </w:pPr>
-      <w:r>
-        <w:rPr>
-          <w:b w:val="1"/>
-        </w:rPr>
-        <w:t xml:space="preserve">一个门卫。</w:t>
-      </w:r>
-      <w:r>
-        <w:t xml:space="preserve"> 门控里常驻一个 0.6B 的小模型，专门干一件事：把要出门的内容逐字扫一遍，看有没有隐私。它认 9 类东西：人名、邮箱、电话、地址、网址、日期、账号、机密事项和其他。抓到了，要么打码，要么拦下。扫完之后，系统把「即将离开设备的确切内容」弹给你看，你点头，这一小段才发。批准的是这一次、这一段，不是给整台设备发通行证。发出去的目标也只能是白名单里的地址，每一次都留账。</w:t>
-      </w:r>
-    </w:p>
-    <w:p>
-      <w:pPr>
-        <w:spacing w:before="0" w:after="160"/>
-      </w:pPr>
-      <w:r>
-        <w:rPr>
-          <w:b w:val="1"/>
-        </w:rPr>
-        <w:t xml:space="preserve">一间小黑屋。</w:t>
-      </w:r>
-      <w:r>
-        <w:t xml:space="preserve"> 真正涉密的计算，比如算工资、看合同、翻客户数据，连门都不让它靠近。这类活儿派给一个隔离的本地子代理，在自己的沙箱里算完，只回一句结论，不回原始数据。云端要是需要参考，拿到的也只是「非身份汇总」。</w:t>
-      </w:r>
-    </w:p>
-    <w:p>
-      <w:pPr>
-        <w:spacing w:before="0" w:after="160"/>
-      </w:pPr>
-      <w:r>
-        <w:t xml:space="preserve">还有一条最关键的规矩：</w:t>
-      </w:r>
-      <w:r>
-        <w:rPr>
-          <w:b w:val="1"/>
-        </w:rPr>
-        <w:t xml:space="preserve">门锁坏了，门就一直关着。</w:t>
-      </w:r>
-      <w:r>
-        <w:t xml:space="preserve"> 沙箱不可用，涉密功能直接禁用，不做「先跑完再说」的降级。很多系统的坏习惯是安全组件挂了照样干活，这里反过来。</w:t>
-      </w:r>
-    </w:p>
-    <w:p>
-      <w:pPr>
-        <w:spacing w:before="0" w:after="160"/>
-      </w:pPr>
-      <w:r>
-        <w:t xml:space="preserve">云端那边呢？它碰不到本地文件，调不了本地工具，看不到完整对话，也不能主动往回推东西。它只收到你批准过的那一小段，只能回一段文字建议。就算叫了云端，暴露面也只有这一次任务的最小集合。</w:t>
-      </w:r>
-    </w:p>
-    <w:p>
-      <w:bookmarkStart w:id="104" w:name="_h104"/>
-      <w:pPr>
-        <w:pStyle w:val="dingding-heading3"/>
-      </w:pPr>
-      <w:r>
-        <w:t xml:space="preserve">1.3 隐私在哪里看得见</w:t>
-      </w:r>
-      <w:bookmarkEnd w:id="104"/>
-    </w:p>
-    <w:p>
-      <w:pPr>
-        <w:spacing w:before="0" w:after="160"/>
-      </w:pPr>
-      <w:r>
-        <w:t xml:space="preserve">安全机制最怕只活在架构图里。这套方案里，隐私是用户每天都摸得到的东西：</w:t>
-      </w:r>
-    </w:p>
-    <w:p>
-      <w:pPr>
-        <w:numPr>
-          <w:ilvl w:val="0"/>
-          <w:numId w:val="2"/>
-        </w:numPr>
-        <w:spacing w:before="0" w:after="80"/>
-      </w:pPr>
-      <w:r>
-        <w:rPr>
-          <w:b w:val="1"/>
-        </w:rPr>
-        <w:t xml:space="preserve">出门前的弹窗。</w:t>
-      </w:r>
-      <w:r>
-        <w:t xml:space="preserve"> 每次要上云，你先看到要发的原文，敏感字段已经高亮或打码。不点，就不发。</w:t>
-      </w:r>
-    </w:p>
-    <w:p>
-      <w:pPr>
-        <w:numPr>
-          <w:ilvl w:val="0"/>
-          <w:numId w:val="2"/>
-        </w:numPr>
-        <w:spacing w:before="0" w:after="80"/>
-      </w:pPr>
-      <w:r>
-        <w:rPr>
-          <w:b w:val="1"/>
-        </w:rPr>
-        <w:t xml:space="preserve">一本流水账。</w:t>
-      </w:r>
-      <w:r>
-        <w:t xml:space="preserve"> 什么时候、发了什么、发去哪、谁批的，全有记录。审计不用靠回忆。</w:t>
-      </w:r>
-    </w:p>
-    <w:p>
-      <w:pPr>
-        <w:numPr>
-          <w:ilvl w:val="0"/>
-          <w:numId w:val="2"/>
-        </w:numPr>
-        <w:spacing w:before="0" w:after="80"/>
-      </w:pPr>
-      <w:r>
-        <w:rPr>
-          <w:b w:val="1"/>
-        </w:rPr>
-        <w:t xml:space="preserve">门卫的成绩单。</w:t>
-      </w:r>
-      <w:r>
-        <w:t xml:space="preserve"> 材料里的实测：长文档里 100 处隐私能抓到 97 处（原来是 83 处）；同一个人名反复出现时，能一直认出来的比例是 79.4%，对比前沿云端大模型只有 57.0%；而且它和主模型共用一张卡，显存只占 5%。</w:t>
-      </w:r>
-    </w:p>
-    <w:p>
-      <w:pPr>
-        <w:numPr>
-          <w:ilvl w:val="0"/>
-          <w:numId w:val="2"/>
-        </w:numPr>
-        <w:spacing w:before="0" w:after="80"/>
-      </w:pPr>
-      <w:r>
-        <w:rPr>
-          <w:b w:val="1"/>
-        </w:rPr>
-        <w:t xml:space="preserve">拒绝也算数据。</w:t>
-      </w:r>
-      <w:r>
-        <w:t xml:space="preserve"> 用户驳回率、误拦截率会一直被盯着。拦得太松是漏，拦得太紧是烦，两头都要调。</w:t>
-      </w:r>
-    </w:p>
-    <w:p>
-      <w:pPr>
-        <w:spacing w:before="0" w:after="60"/>
-      </w:pPr>
-    </w:p>
-    <w:p>
-      <w:pPr>
-        <w:spacing w:before="0" w:after="160"/>
-      </w:pPr>
-      <w:r>
-        <w:t xml:space="preserve">对比一下纯云方案：以上四样，一样都没有。你只能相信服务条款。</w:t>
-      </w:r>
-    </w:p>
-    <w:p>
-      <w:pPr>
-        <w:pStyle w:val="dingding_quote"/>
-        <w:spacing w:before="0" w:after="160"/>
-      </w:pPr>
-      <w:r>
-        <w:t xml:space="preserve">这些指标来自材料中的设计与评测记录，落地时仍要在自己的数据和链路上复验。PII 审查不是「零漏检」承诺。</w:t>
-      </w:r>
-    </w:p>
-    <w:p>
-      <w:pPr>
-        <w:pBdr>
-          <w:top w:val="single" w:sz="6" w:space="1" w:color="E3E5E8"/>
-        </w:pBdr>
-        <w:spacing w:before="200" w:after="200"/>
-      </w:pPr>
-    </w:p>
-    <w:p>
-      <w:bookmarkStart w:id="105" w:name="_h105"/>
-      <w:pPr>
-        <w:pStyle w:val="dingding-heading2"/>
-      </w:pPr>
-      <w:r>
-        <w:t xml:space="preserve">二、省钱：云端账单到底能省多少</w:t>
-      </w:r>
-      <w:bookmarkEnd w:id="105"/>
-    </w:p>
-    <w:p>
-      <w:pPr>
         <w:spacing w:before="120" w:after="200"/>
         <w:jc w:val="center"/>
       </w:pPr>
       <w:r>
         <w:drawing>
           <wp:inline distT="0" distB="0" distL="0" distR="0">
-            <wp:extent cx="2194560" cy="2194560"/>
+            <wp:extent cx="2377440" cy="2130629"/>
             <wp:effectExtent l="0" t="0" r="0" b="0"/>
-            <wp:docPr id="2" name="meme_money.png"/>
+            <wp:docPr id="2" name="priv_shield.png"/>
             <wp:cNvGraphicFramePr>
               <a:graphicFrameLocks xmlns:a="http://schemas.openxmlformats.org/drawingml/2006/main" noChangeAspect="1"/>
             </wp:cNvGraphicFramePr>
@@ -908,11 +657,259 @@
               <a:graphicData uri="http://schemas.openxmlformats.org/drawingml/2006/picture">
                 <pic:pic xmlns:pic="http://schemas.openxmlformats.org/drawingml/2006/picture">
                   <pic:nvPicPr>
-                    <pic:cNvPr id="2" name="meme_money.png"/>
+                    <pic:cNvPr id="2" name="priv_shield.png"/>
                     <pic:cNvPicPr/>
                   </pic:nvPicPr>
                   <pic:blipFill>
                     <a:blip r:embed="rId12"/>
+                    <a:stretch>
+                      <a:fillRect/>
+                    </a:stretch>
+                  </pic:blipFill>
+                  <pic:spPr>
+                    <a:xfrm>
+                      <a:off x="0" y="0"/>
+                      <a:ext cx="2377440" cy="2130629"/>
+                    </a:xfrm>
+                    <a:prstGeom prst="rect">
+                      <a:avLst/>
+                    </a:prstGeom>
+                  </pic:spPr>
+                </pic:pic>
+              </a:graphicData>
+            </a:graphic>
+          </wp:inline>
+        </w:drawing>
+      </w:r>
+    </w:p>
+    <w:p>
+      <w:pPr>
+        <w:spacing w:before="0" w:after="160"/>
+      </w:pPr>
+      <w:r>
+        <w:t xml:space="preserve">只在系统提示里写一句「请注意隐私」，就像在门口贴张纸条「贵重物品请勿带出」。有礼貌，没用。我们要的是真的会关上的门。整套做法用三个词就能记住：</w:t>
+      </w:r>
+    </w:p>
+    <w:p>
+      <w:pPr>
+        <w:spacing w:before="0" w:after="160"/>
+      </w:pPr>
+      <w:r>
+        <w:rPr>
+          <w:b w:val="1"/>
+        </w:rPr>
+        <w:t xml:space="preserve">一道门。</w:t>
+      </w:r>
+      <w:r>
+        <w:t xml:space="preserve"> 整台盒子默认零出网，只留一个网络出口，而且只有 Agent 内置的「出网门控」能走这个口。任何工具、任何沙箱都不能自己联网。想出门，只能过门控。</w:t>
+      </w:r>
+    </w:p>
+    <w:p>
+      <w:pPr>
+        <w:spacing w:before="0" w:after="160"/>
+      </w:pPr>
+      <w:r>
+        <w:rPr>
+          <w:b w:val="1"/>
+        </w:rPr>
+        <w:t xml:space="preserve">一个门卫。</w:t>
+      </w:r>
+      <w:r>
+        <w:t xml:space="preserve"> 门控里常驻一个 0.6B 的小模型，专门干一件事：把要出门的内容逐字扫一遍，看有没有隐私。它认 9 类东西：人名、邮箱、电话、地址、网址、日期、账号、机密事项和其他。抓到了，要么打码，要么拦下。扫完之后，系统把「即将离开设备的确切内容」弹给你看，你点头，这一小段才发。批准的是这一次、这一段，不是给整台设备发通行证。发出去的目标也只能是白名单里的地址，每一次都留账。</w:t>
+      </w:r>
+    </w:p>
+    <w:p>
+      <w:pPr>
+        <w:spacing w:before="0" w:after="160"/>
+      </w:pPr>
+      <w:r>
+        <w:rPr>
+          <w:b w:val="1"/>
+        </w:rPr>
+        <w:t xml:space="preserve">一间小黑屋。</w:t>
+      </w:r>
+      <w:r>
+        <w:t xml:space="preserve"> 真正涉密的计算，比如算工资、看合同、翻客户数据，连门都不让它靠近。这类活儿派给一个隔离的本地子代理，在自己的沙箱里算完，只回一句结论，不回原始数据。云端要是需要参考，拿到的也只是「非身份汇总」。</w:t>
+      </w:r>
+    </w:p>
+    <w:p>
+      <w:pPr>
+        <w:spacing w:before="0" w:after="160"/>
+      </w:pPr>
+      <w:r>
+        <w:t xml:space="preserve">还有一条最关键的规矩：</w:t>
+      </w:r>
+      <w:r>
+        <w:rPr>
+          <w:b w:val="1"/>
+        </w:rPr>
+        <w:t xml:space="preserve">门锁坏了，门就一直关着。</w:t>
+      </w:r>
+      <w:r>
+        <w:t xml:space="preserve"> 沙箱不可用，涉密功能直接禁用，不做「先跑完再说」的降级。很多系统的坏习惯是安全组件挂了照样干活，这里反过来。</w:t>
+      </w:r>
+    </w:p>
+    <w:p>
+      <w:pPr>
+        <w:spacing w:before="0" w:after="160"/>
+      </w:pPr>
+      <w:r>
+        <w:t xml:space="preserve">云端那边呢？它碰不到本地文件，调不了本地工具，看不到完整对话，也不能主动往回推东西。它只收到你批准过的那一小段，只能回一段文字建议。就算叫了云端，暴露面也只有这一次任务的最小集合。</w:t>
+      </w:r>
+    </w:p>
+    <w:p>
+      <w:bookmarkStart w:id="104" w:name="_h104"/>
+      <w:pPr>
+        <w:pStyle w:val="dingding-heading3"/>
+      </w:pPr>
+      <w:r>
+        <w:t xml:space="preserve">1.3 隐私在哪里看得见</w:t>
+      </w:r>
+      <w:bookmarkEnd w:id="104"/>
+    </w:p>
+    <w:p>
+      <w:pPr>
+        <w:spacing w:before="0" w:after="160"/>
+      </w:pPr>
+      <w:r>
+        <w:t xml:space="preserve">安全机制最怕只活在架构图里。这套方案里，隐私是用户每天都摸得到的东西：</w:t>
+      </w:r>
+    </w:p>
+    <w:p>
+      <w:pPr>
+        <w:numPr>
+          <w:ilvl w:val="0"/>
+          <w:numId w:val="2"/>
+        </w:numPr>
+        <w:spacing w:before="0" w:after="80"/>
+      </w:pPr>
+      <w:r>
+        <w:rPr>
+          <w:b w:val="1"/>
+        </w:rPr>
+        <w:t xml:space="preserve">出门前的弹窗。</w:t>
+      </w:r>
+      <w:r>
+        <w:t xml:space="preserve"> 每次要上云，你先看到要发的原文，敏感字段已经高亮或打码。不点，就不发。</w:t>
+      </w:r>
+    </w:p>
+    <w:p>
+      <w:pPr>
+        <w:numPr>
+          <w:ilvl w:val="0"/>
+          <w:numId w:val="2"/>
+        </w:numPr>
+        <w:spacing w:before="0" w:after="80"/>
+      </w:pPr>
+      <w:r>
+        <w:rPr>
+          <w:b w:val="1"/>
+        </w:rPr>
+        <w:t xml:space="preserve">一本流水账。</w:t>
+      </w:r>
+      <w:r>
+        <w:t xml:space="preserve"> 什么时候、发了什么、发去哪、谁批的，全有记录。审计不用靠回忆。</w:t>
+      </w:r>
+    </w:p>
+    <w:p>
+      <w:pPr>
+        <w:numPr>
+          <w:ilvl w:val="0"/>
+          <w:numId w:val="2"/>
+        </w:numPr>
+        <w:spacing w:before="0" w:after="80"/>
+      </w:pPr>
+      <w:r>
+        <w:rPr>
+          <w:b w:val="1"/>
+        </w:rPr>
+        <w:t xml:space="preserve">门卫的成绩单。</w:t>
+      </w:r>
+      <w:r>
+        <w:t xml:space="preserve"> 材料里的实测：长文档里 100 处隐私能抓到 97 处（原来是 83 处）；同一个人名反复出现时，能一直认出来的比例是 79.4%，对比前沿云端大模型只有 57.0%；而且它和主模型共用一张卡，显存只占 5%。</w:t>
+      </w:r>
+    </w:p>
+    <w:p>
+      <w:pPr>
+        <w:numPr>
+          <w:ilvl w:val="0"/>
+          <w:numId w:val="2"/>
+        </w:numPr>
+        <w:spacing w:before="0" w:after="80"/>
+      </w:pPr>
+      <w:r>
+        <w:rPr>
+          <w:b w:val="1"/>
+        </w:rPr>
+        <w:t xml:space="preserve">拒绝也算数据。</w:t>
+      </w:r>
+      <w:r>
+        <w:t xml:space="preserve"> 用户驳回率、误拦截率会一直被盯着。拦得太松是漏，拦得太紧是烦，两头都要调。</w:t>
+      </w:r>
+    </w:p>
+    <w:p>
+      <w:pPr>
+        <w:spacing w:before="0" w:after="60"/>
+      </w:pPr>
+    </w:p>
+    <w:p>
+      <w:pPr>
+        <w:spacing w:before="0" w:after="160"/>
+      </w:pPr>
+      <w:r>
+        <w:t xml:space="preserve">对比一下纯云方案：以上四样，一样都没有。你只能相信服务条款。</w:t>
+      </w:r>
+    </w:p>
+    <w:p>
+      <w:pPr>
+        <w:pStyle w:val="dingding_quote"/>
+        <w:spacing w:before="0" w:after="160"/>
+      </w:pPr>
+      <w:r>
+        <w:t xml:space="preserve">这些指标来自材料中的设计与评测记录，落地时仍要在自己的数据和链路上复验。PII 审查不是「零漏检」承诺。</w:t>
+      </w:r>
+    </w:p>
+    <w:p>
+      <w:pPr>
+        <w:pBdr>
+          <w:top w:val="single" w:sz="6" w:space="1" w:color="E3E5E8"/>
+        </w:pBdr>
+        <w:spacing w:before="200" w:after="200"/>
+      </w:pPr>
+    </w:p>
+    <w:p>
+      <w:bookmarkStart w:id="105" w:name="_h105"/>
+      <w:pPr>
+        <w:pStyle w:val="dingding-heading2"/>
+      </w:pPr>
+      <w:r>
+        <w:t xml:space="preserve">二、省钱：云端账单到底能省多少</w:t>
+      </w:r>
+      <w:bookmarkEnd w:id="105"/>
+    </w:p>
+    <w:p>
+      <w:pPr>
+        <w:spacing w:before="120" w:after="200"/>
+        <w:jc w:val="center"/>
+      </w:pPr>
+      <w:r>
+        <w:drawing>
+          <wp:inline distT="0" distB="0" distL="0" distR="0">
+            <wp:extent cx="2194560" cy="2194560"/>
+            <wp:effectExtent l="0" t="0" r="0" b="0"/>
+            <wp:docPr id="3" name="money_tom.png"/>
+            <wp:cNvGraphicFramePr>
+              <a:graphicFrameLocks xmlns:a="http://schemas.openxmlformats.org/drawingml/2006/main" noChangeAspect="1"/>
+            </wp:cNvGraphicFramePr>
+            <a:graphic xmlns:a="http://schemas.openxmlformats.org/drawingml/2006/main">
+              <a:graphicData uri="http://schemas.openxmlformats.org/drawingml/2006/picture">
+                <pic:pic xmlns:pic="http://schemas.openxmlformats.org/drawingml/2006/picture">
+                  <pic:nvPicPr>
+                    <pic:cNvPr id="3" name="money_tom.png"/>
+                    <pic:cNvPicPr/>
+                  </pic:nvPicPr>
+                  <pic:blipFill>
+                    <a:blip r:embed="rId13"/>
                     <a:stretch>
                       <a:fillRect/>
                     </a:stretch>
@@ -1334,7 +1331,7 @@
           <wp:inline distT="0" distB="0" distL="0" distR="0">
             <wp:extent cx="9363075" cy="5559149"/>
             <wp:effectExtent l="0" t="0" r="0" b="0"/>
-            <wp:docPr id="3" name="fig_savings.png"/>
+            <wp:docPr id="4" name="fig_savings.png"/>
             <wp:cNvGraphicFramePr>
               <a:graphicFrameLocks xmlns:a="http://schemas.openxmlformats.org/drawingml/2006/main" noChangeAspect="1"/>
             </wp:cNvGraphicFramePr>
@@ -1342,11 +1339,11 @@
               <a:graphicData uri="http://schemas.openxmlformats.org/drawingml/2006/picture">
                 <pic:pic xmlns:pic="http://schemas.openxmlformats.org/drawingml/2006/picture">
                   <pic:nvPicPr>
-                    <pic:cNvPr id="3" name="fig_savings.png"/>
+                    <pic:cNvPr id="4" name="fig_savings.png"/>
                     <pic:cNvPicPr/>
                   </pic:nvPicPr>
                   <pic:blipFill>
-                    <a:blip r:embed="rId13"/>
+                    <a:blip r:embed="rId14"/>
                     <a:stretch>
                       <a:fillRect/>
                     </a:stretch>
@@ -1815,7 +1812,7 @@
           <wp:inline distT="0" distB="0" distL="0" distR="0">
             <wp:extent cx="9363075" cy="5266729"/>
             <wp:effectExtent l="0" t="0" r="0" b="0"/>
-            <wp:docPr id="4" name="nv_switchyard.png"/>
+            <wp:docPr id="5" name="nv_switchyard.png"/>
             <wp:cNvGraphicFramePr>
               <a:graphicFrameLocks xmlns:a="http://schemas.openxmlformats.org/drawingml/2006/main" noChangeAspect="1"/>
             </wp:cNvGraphicFramePr>
@@ -1823,11 +1820,11 @@
               <a:graphicData uri="http://schemas.openxmlformats.org/drawingml/2006/picture">
                 <pic:pic xmlns:pic="http://schemas.openxmlformats.org/drawingml/2006/picture">
                   <pic:nvPicPr>
-                    <pic:cNvPr id="4" name="nv_switchyard.png"/>
+                    <pic:cNvPr id="5" name="nv_switchyard.png"/>
                     <pic:cNvPicPr/>
                   </pic:nvPicPr>
                   <pic:blipFill>
-                    <a:blip r:embed="rId14"/>
+                    <a:blip r:embed="rId15"/>
                     <a:stretch>
                       <a:fillRect/>
                     </a:stretch>
@@ -1955,14 +1952,77 @@
       </w:pPr>
     </w:p>
     <w:p>
+      <w:pPr>
+        <w:pBdr>
+          <w:top w:val="single" w:sz="6" w:space="1" w:color="E3E5E8"/>
+        </w:pBdr>
+        <w:spacing w:before="200" w:after="200"/>
+      </w:pPr>
+    </w:p>
+    <w:p>
       <w:bookmarkStart w:id="110" w:name="_h110"/>
       <w:pPr>
+        <w:pStyle w:val="dingding-heading2"/>
+      </w:pPr>
+      <w:r>
+        <w:t xml:space="preserve">三、架构：本地当店长，云端做会诊</w:t>
+      </w:r>
+      <w:bookmarkEnd w:id="110"/>
+    </w:p>
+    <w:p>
+      <w:pPr>
+        <w:spacing w:before="0" w:after="160"/>
+      </w:pPr>
+      <w:r>
+        <w:t xml:space="preserve">前两章说的「门」和「截流」，落到一台设备上是什么样？这一章讲清楚。业界已经有一些方案，架构都很接近：一个本地编排器当店长，一个路由器决定什么时候叫云端。</w:t>
+      </w:r>
+    </w:p>
+    <w:p>
+      <w:bookmarkStart w:id="111" w:name="_h111"/>
+      <w:pPr>
         <w:pStyle w:val="dingding-heading3"/>
       </w:pPr>
       <w:r>
-        <w:t xml:space="preserve">2.5 别被数字忽悠：四条提醒</w:t>
-      </w:r>
-      <w:bookmarkEnd w:id="110"/>
+        <w:t xml:space="preserve">3.1 业界方案长得都差不多：一个管「家」，一个管「路」</w:t>
+      </w:r>
+      <w:bookmarkEnd w:id="111"/>
+    </w:p>
+    <w:p>
+      <w:pPr>
+        <w:spacing w:before="0" w:after="160"/>
+      </w:pPr>
+      <w:r>
+        <w:rPr>
+          <w:b w:val="1"/>
+        </w:rPr>
+        <w:t xml:space="preserve">管「家」的：以 Perplexity Portable Computer 为例。</w:t>
+      </w:r>
+      <w:r>
+        <w:t xml:space="preserve"> 2026 年 2 月 Perplexity 发布了 Computer：一个会拆任务、派子代理、在沙箱里跑工具、还接 Slack / GitHub / 邮件的多模型 Agent。8 月它又和 NVIDIA 一起推出了完全本地版 Portable Computer：编排模型、子代理模型、Agent 运行时、工具沙箱、连接器，全部跑在你自己的硬件上（DGX Spark，或任何 24GB 显存以上的 RTX 卡），本地模型是一个专门为 Agent 后训练过的 27B。本地完成的步骤</w:t>
+      </w:r>
+      <w:r>
+        <w:rPr>
+          <w:b w:val="1"/>
+        </w:rPr>
+        <w:t xml:space="preserve">不消耗一分钱云端额度</w:t>
+      </w:r>
+      <w:r>
+        <w:t xml:space="preserve">；真需要前沿推理时，先弹窗要你批准，出站内容先过隐私标记，云端只能回文字建议。沙箱是操作系统级强制隔离，沙箱不可用就直接禁用工具执行。第一章那三个词，在这类方案里都能找到对应。</w:t>
+      </w:r>
+    </w:p>
+    <w:p>
+      <w:pPr>
+        <w:spacing w:before="0" w:after="160"/>
+      </w:pPr>
+      <w:r>
+        <w:rPr>
+          <w:b w:val="1"/>
+        </w:rPr>
+        <w:t xml:space="preserve">管「路」的：以 NVIDIA NeMo Switchyard 为例。</w:t>
+      </w:r>
+      <w:r>
+        <w:t xml:space="preserve"> 它是 NVIDIA 开源的模型路由层，专门回答一个问题：Agent 的这一次调用，到底要不要花前沿模型的钱？它自带几种现成的路由器，大白话版：</w:t>
+      </w:r>
     </w:p>
     <w:p>
       <w:pPr>
@@ -1976,10 +2036,10 @@
         <w:rPr>
           <w:b w:val="1"/>
         </w:rPr>
-        <w:t xml:space="preserve">省的是云账单，不是总成本。</w:t>
-      </w:r>
-      <w:r>
-        <w:t xml:space="preserve"> 盒子的硬件和电费另算。云账单降了，不等于总拥有成本已经被证明降了。</w:t>
+        <w:t xml:space="preserve">升级路由：</w:t>
+      </w:r>
+      <w:r>
+        <w:t xml:space="preserve"> 先让便宜模型干，旁边有个裁判盯着。连续两次判定「卡住了」，这个任务之后全交给贵模型。只升不降。</w:t>
       </w:r>
     </w:p>
     <w:p>
@@ -1994,10 +2054,10 @@
         <w:rPr>
           <w:b w:val="1"/>
         </w:rPr>
-        <w:t xml:space="preserve">效果有代价，代价不一样。</w:t>
-      </w:r>
-      <w:r>
-        <w:t xml:space="preserve"> 有的场景只差 0.3 分，有的差 6 分。它们来自不同的评测，不能拼成一句「效果不变」。</w:t>
+        <w:t xml:space="preserve">阶段路由：</w:t>
+      </w:r>
+      <w:r>
+        <w:t xml:space="preserve"> 看最近的进度。稳稳当当改代码、测试都过了，用便宜的；报错连连、原地打转，换贵的。</w:t>
       </w:r>
     </w:p>
     <w:p>
@@ -2012,10 +2072,10 @@
         <w:rPr>
           <w:b w:val="1"/>
         </w:rPr>
-        <w:t xml:space="preserve">证据有等级。</w:t>
-      </w:r>
-      <w:r>
-        <w:t xml:space="preserve"> 有的可复现，有的评测集在别人手里，有的配置没公开。附一每一行都标了来源，决策时按证据等级给权重。</w:t>
+        <w:t xml:space="preserve">分类路由：</w:t>
+      </w:r>
+      <w:r>
+        <w:t xml:space="preserve"> 一开始就判断这活儿难不难，定了模型就不再反复换。</w:t>
       </w:r>
     </w:p>
     <w:p>
@@ -2030,10 +2090,10 @@
         <w:rPr>
           <w:b w:val="1"/>
         </w:rPr>
-        <w:t xml:space="preserve">全本地 100% 只说明不花云端的钱。</w:t>
-      </w:r>
-      <w:r>
-        <w:t xml:space="preserve"> 效果好不好，得在同一个评测框架里跑过才算数。没跑过，就老实写「待验证」。</w:t>
+        <w:t xml:space="preserve">可训练路由：</w:t>
+      </w:r>
+      <w:r>
+        <w:t xml:space="preserve"> 学着预测哪个模型更可能做对，再按成本和延迟做取舍。</w:t>
       </w:r>
     </w:p>
     <w:p>
@@ -2043,28 +2103,19 @@
     </w:p>
     <w:p>
       <w:pPr>
-        <w:pBdr>
-          <w:top w:val="single" w:sz="6" w:space="1" w:color="E3E5E8"/>
-        </w:pBdr>
-        <w:spacing w:before="200" w:after="200"/>
-      </w:pPr>
-    </w:p>
-    <w:p>
-      <w:bookmarkStart w:id="111" w:name="_h111"/>
-      <w:pPr>
-        <w:pStyle w:val="dingding-heading2"/>
-      </w:pPr>
-      <w:r>
-        <w:t xml:space="preserve">三、架构：本地当店长，云端做会诊</w:t>
-      </w:r>
-      <w:bookmarkEnd w:id="111"/>
-    </w:p>
-    <w:p>
-      <w:pPr>
         <w:spacing w:before="0" w:after="160"/>
       </w:pPr>
       <w:r>
-        <w:t xml:space="preserve">前两章说的「门」和「截流」，落到一台设备上是什么样？这一章讲清楚。好消息是不用从零画图，业界已经有两份现成的作业。</w:t>
+        <w:t xml:space="preserve">第二章那些「还要上云 X%」，大多就是这些路由器在 Terminal-Bench、τ²-bench 和 LangChain 任务集上跑出来的。一句话：</w:t>
+      </w:r>
+      <w:r>
+        <w:rPr>
+          <w:b w:val="1"/>
+        </w:rPr>
+        <w:t xml:space="preserve">「家」决定本地怎么布置，「路」决定什么时候该出门、出门带多少东西。</w:t>
+      </w:r>
+      <w:r>
+        <w:t xml:space="preserve"> 我们的架构也是这两块拼起来的。</w:t>
       </w:r>
     </w:p>
     <w:p>
@@ -2073,147 +2124,9 @@
         <w:pStyle w:val="dingding-heading3"/>
       </w:pPr>
       <w:r>
-        <w:t xml:space="preserve">3.1 抄谁的作业：Perplexity 管「家」，Switchyard 管「路」</w:t>
+        <w:t xml:space="preserve">3.2 一图看完：五步闭环</w:t>
       </w:r>
       <w:bookmarkEnd w:id="112"/>
-    </w:p>
-    <w:p>
-      <w:pPr>
-        <w:spacing w:before="0" w:after="160"/>
-      </w:pPr>
-      <w:r>
-        <w:rPr>
-          <w:b w:val="1"/>
-        </w:rPr>
-        <w:t xml:space="preserve">Perplexity Portable Computer，负责「家里怎么布置」。</w:t>
-      </w:r>
-      <w:r>
-        <w:t xml:space="preserve"> 2026 年 2 月 Perplexity 发布了 Computer：一个会拆任务、派子代理、在沙箱里跑工具、还接 Slack / GitHub / 邮件的多模型 Agent。8 月它又和 NVIDIA 一起推出了完全本地版 Portable Computer：编排模型、子代理模型、Agent 运行时、工具沙箱、连接器，全部跑在你自己的硬件上（DGX Spark，或任何 24GB 显存以上的 RTX 卡），本地模型是一个专门为 Agent 后训练过的 27B。本地完成的步骤</w:t>
-      </w:r>
-      <w:r>
-        <w:rPr>
-          <w:b w:val="1"/>
-        </w:rPr>
-        <w:t xml:space="preserve">不消耗一分钱云端额度</w:t>
-      </w:r>
-      <w:r>
-        <w:t xml:space="preserve">；真需要前沿推理时，先弹窗要你批准，出站内容先过隐私标记，云端只能回文字建议。沙箱是操作系统级强制隔离，沙箱不可用就直接禁用工具执行。第一章那三个词，基本就是从这来的。</w:t>
-      </w:r>
-    </w:p>
-    <w:p>
-      <w:pPr>
-        <w:spacing w:before="0" w:after="160"/>
-      </w:pPr>
-      <w:r>
-        <w:rPr>
-          <w:b w:val="1"/>
-        </w:rPr>
-        <w:t xml:space="preserve">NVIDIA NeMo Switchyard，负责「什么时候出门」。</w:t>
-      </w:r>
-      <w:r>
-        <w:t xml:space="preserve"> 它是 NVIDIA 开源的模型路由层，专门回答一个问题：Agent 的这一次调用，到底要不要花前沿模型的钱？它自带几种现成的路由器，大白话版：</w:t>
-      </w:r>
-    </w:p>
-    <w:p>
-      <w:pPr>
-        <w:numPr>
-          <w:ilvl w:val="0"/>
-          <w:numId w:val="5"/>
-        </w:numPr>
-        <w:spacing w:before="0" w:after="80"/>
-      </w:pPr>
-      <w:r>
-        <w:rPr>
-          <w:b w:val="1"/>
-        </w:rPr>
-        <w:t xml:space="preserve">升级路由：</w:t>
-      </w:r>
-      <w:r>
-        <w:t xml:space="preserve"> 先让便宜模型干，旁边有个裁判盯着。连续两次判定「卡住了」，这个任务之后全交给贵模型。只升不降。</w:t>
-      </w:r>
-    </w:p>
-    <w:p>
-      <w:pPr>
-        <w:numPr>
-          <w:ilvl w:val="0"/>
-          <w:numId w:val="5"/>
-        </w:numPr>
-        <w:spacing w:before="0" w:after="80"/>
-      </w:pPr>
-      <w:r>
-        <w:rPr>
-          <w:b w:val="1"/>
-        </w:rPr>
-        <w:t xml:space="preserve">阶段路由：</w:t>
-      </w:r>
-      <w:r>
-        <w:t xml:space="preserve"> 看最近的进度。稳稳当当改代码、测试都过了，用便宜的；报错连连、原地打转，换贵的。</w:t>
-      </w:r>
-    </w:p>
-    <w:p>
-      <w:pPr>
-        <w:numPr>
-          <w:ilvl w:val="0"/>
-          <w:numId w:val="5"/>
-        </w:numPr>
-        <w:spacing w:before="0" w:after="80"/>
-      </w:pPr>
-      <w:r>
-        <w:rPr>
-          <w:b w:val="1"/>
-        </w:rPr>
-        <w:t xml:space="preserve">分类路由：</w:t>
-      </w:r>
-      <w:r>
-        <w:t xml:space="preserve"> 一开始就判断这活儿难不难，定了模型就不再反复换。</w:t>
-      </w:r>
-    </w:p>
-    <w:p>
-      <w:pPr>
-        <w:numPr>
-          <w:ilvl w:val="0"/>
-          <w:numId w:val="5"/>
-        </w:numPr>
-        <w:spacing w:before="0" w:after="80"/>
-      </w:pPr>
-      <w:r>
-        <w:rPr>
-          <w:b w:val="1"/>
-        </w:rPr>
-        <w:t xml:space="preserve">可训练路由：</w:t>
-      </w:r>
-      <w:r>
-        <w:t xml:space="preserve"> 学着预测哪个模型更可能做对，再按成本和延迟做取舍。</w:t>
-      </w:r>
-    </w:p>
-    <w:p>
-      <w:pPr>
-        <w:spacing w:before="0" w:after="60"/>
-      </w:pPr>
-    </w:p>
-    <w:p>
-      <w:pPr>
-        <w:spacing w:before="0" w:after="160"/>
-      </w:pPr>
-      <w:r>
-        <w:t xml:space="preserve">第二章那些「还要上云 X%」，大多就是这些路由器在 Terminal-Bench、τ²-bench 和 LangChain 任务集上跑出来的。一句话：</w:t>
-      </w:r>
-      <w:r>
-        <w:rPr>
-          <w:b w:val="1"/>
-        </w:rPr>
-        <w:t xml:space="preserve">Perplexity 告诉你本地这个家怎么布置，Switchyard 告诉你什么时候该出门、出门带多少东西。</w:t>
-      </w:r>
-    </w:p>
-    <w:p>
-      <w:bookmarkStart w:id="113" w:name="_h113"/>
-      <w:pPr>
-        <w:pStyle w:val="dingding-heading3"/>
-      </w:pPr>
-      <w:r>
-        <w:t xml:space="preserve">3.2 一图看完：五步闭环</w:t>
-      </w:r>
-      <w:bookmarkEnd w:id="113"/>
     </w:p>
     <w:p>
       <w:pPr>
@@ -2225,7 +2138,7 @@
           <wp:inline distT="0" distB="0" distL="0" distR="0">
             <wp:extent cx="2377440" cy="1570338"/>
             <wp:effectExtent l="0" t="0" r="0" b="0"/>
-            <wp:docPr id="5" name="meme_tutu.png"/>
+            <wp:docPr id="6" name="meme_tutu.png"/>
             <wp:cNvGraphicFramePr>
               <a:graphicFrameLocks xmlns:a="http://schemas.openxmlformats.org/drawingml/2006/main" noChangeAspect="1"/>
             </wp:cNvGraphicFramePr>
@@ -2233,11 +2146,11 @@
               <a:graphicData uri="http://schemas.openxmlformats.org/drawingml/2006/picture">
                 <pic:pic xmlns:pic="http://schemas.openxmlformats.org/drawingml/2006/picture">
                   <pic:nvPicPr>
-                    <pic:cNvPr id="5" name="meme_tutu.png"/>
+                    <pic:cNvPr id="6" name="meme_tutu.png"/>
                     <pic:cNvPicPr/>
                   </pic:nvPicPr>
                   <pic:blipFill>
-                    <a:blip r:embed="rId15"/>
+                    <a:blip r:embed="rId16"/>
                     <a:stretch>
                       <a:fillRect/>
                     </a:stretch>
@@ -2268,7 +2181,7 @@
           <wp:inline distT="0" distB="0" distL="0" distR="0">
             <wp:extent cx="9363075" cy="5944893"/>
             <wp:effectExtent l="0" t="0" r="0" b="0"/>
-            <wp:docPr id="6" name="fig_arch.png"/>
+            <wp:docPr id="7" name="fig_arch.png"/>
             <wp:cNvGraphicFramePr>
               <a:graphicFrameLocks xmlns:a="http://schemas.openxmlformats.org/drawingml/2006/main" noChangeAspect="1"/>
             </wp:cNvGraphicFramePr>
@@ -2276,11 +2189,11 @@
               <a:graphicData uri="http://schemas.openxmlformats.org/drawingml/2006/picture">
                 <pic:pic xmlns:pic="http://schemas.openxmlformats.org/drawingml/2006/picture">
                   <pic:nvPicPr>
-                    <pic:cNvPr id="6" name="fig_arch.png"/>
+                    <pic:cNvPr id="7" name="fig_arch.png"/>
                     <pic:cNvPicPr/>
                   </pic:nvPicPr>
                   <pic:blipFill>
-                    <a:blip r:embed="rId16"/>
+                    <a:blip r:embed="rId17"/>
                     <a:stretch>
                       <a:fillRect/>
                     </a:stretch>
@@ -2388,14 +2301,14 @@
       </w:r>
     </w:p>
     <w:p>
-      <w:bookmarkStart w:id="114" w:name="_h114"/>
+      <w:bookmarkStart w:id="113" w:name="_h113"/>
       <w:pPr>
         <w:pStyle w:val="dingding-heading3"/>
       </w:pPr>
       <w:r>
         <w:t xml:space="preserve">3.3 谁干什么、不许干什么</w:t>
       </w:r>
-      <w:bookmarkEnd w:id="114"/>
+      <w:bookmarkEnd w:id="113"/>
     </w:p>
     <w:tbl>
       <w:tblPr>
@@ -2793,435 +2706,6 @@
       </w:r>
     </w:p>
     <w:p>
-      <w:bookmarkStart w:id="115" w:name="_h115"/>
-      <w:pPr>
-        <w:pStyle w:val="dingding-heading3"/>
-      </w:pPr>
-      <w:r>
-        <w:t xml:space="preserve">3.4 怎么落地、怎么验收</w:t>
-      </w:r>
-      <w:bookmarkEnd w:id="115"/>
-    </w:p>
-    <w:p>
-      <w:pPr>
-        <w:spacing w:before="120" w:after="200"/>
-        <w:jc w:val="center"/>
-      </w:pPr>
-      <w:r>
-        <w:drawing>
-          <wp:inline distT="0" distB="0" distL="0" distR="0">
-            <wp:extent cx="2011680" cy="2141765"/>
-            <wp:effectExtent l="0" t="0" r="0" b="0"/>
-            <wp:docPr id="7" name="meme_great.png"/>
-            <wp:cNvGraphicFramePr>
-              <a:graphicFrameLocks xmlns:a="http://schemas.openxmlformats.org/drawingml/2006/main" noChangeAspect="1"/>
-            </wp:cNvGraphicFramePr>
-            <a:graphic xmlns:a="http://schemas.openxmlformats.org/drawingml/2006/main">
-              <a:graphicData uri="http://schemas.openxmlformats.org/drawingml/2006/picture">
-                <pic:pic xmlns:pic="http://schemas.openxmlformats.org/drawingml/2006/picture">
-                  <pic:nvPicPr>
-                    <pic:cNvPr id="7" name="meme_great.png"/>
-                    <pic:cNvPicPr/>
-                  </pic:nvPicPr>
-                  <pic:blipFill>
-                    <a:blip r:embed="rId17"/>
-                    <a:stretch>
-                      <a:fillRect/>
-                    </a:stretch>
-                  </pic:blipFill>
-                  <pic:spPr>
-                    <a:xfrm>
-                      <a:off x="0" y="0"/>
-                      <a:ext cx="2011680" cy="2141765"/>
-                    </a:xfrm>
-                    <a:prstGeom prst="rect">
-                      <a:avLst/>
-                    </a:prstGeom>
-                  </pic:spPr>
-                </pic:pic>
-              </a:graphicData>
-            </a:graphic>
-          </wp:inline>
-        </w:drawing>
-      </w:r>
-    </w:p>
-    <w:p>
-      <w:pPr>
-        <w:spacing w:before="0" w:after="160"/>
-      </w:pPr>
-      <w:r>
-        <w:rPr>
-          <w:b w:val="1"/>
-        </w:rPr>
-        <w:t xml:space="preserve">第一步：先看清账本。</w:t>
-      </w:r>
-      <w:r>
-        <w:t xml:space="preserve"> 记录三本 Token 账、还要上云的比例和任务质量，不急着冲最高本地化率。按场景先跑一遍「每次都上云」的基线，再引入本地路由。这一步不是证明本地万能，而是看清哪些轮次真的需要云端。</w:t>
-      </w:r>
-    </w:p>
-    <w:p>
-      <w:pPr>
-        <w:spacing w:before="0" w:after="160"/>
-      </w:pPr>
-      <w:r>
-        <w:rPr>
-          <w:b w:val="1"/>
-        </w:rPr>
-        <w:t xml:space="preserve">第二步：装门卫。</w:t>
-      </w:r>
-      <w:r>
-        <w:t xml:space="preserve"> 所有出站流量收口到一个强制网关，接入隐私审查，展示确切出站内容，逐次批准。同时盯驳回率、误拦截率和多出来的等待时间。</w:t>
-      </w:r>
-    </w:p>
-    <w:p>
-      <w:pPr>
-        <w:spacing w:before="0" w:after="160"/>
-      </w:pPr>
-      <w:r>
-        <w:rPr>
-          <w:b w:val="1"/>
-        </w:rPr>
-        <w:t xml:space="preserve">第三步：盖小黑屋，按场景调阈值。</w:t>
-      </w:r>
-      <w:r>
-        <w:t xml:space="preserve"> 给涉密计算加隔离子代理和「门锁坏了就关门」的策略，再分别调编码、客服、办公助理的路由阈值。</w:t>
-      </w:r>
-    </w:p>
-    <w:p>
-      <w:pPr>
-        <w:spacing w:before="0" w:after="160"/>
-      </w:pPr>
-      <w:r>
-        <w:t xml:space="preserve">验收看四组指标，少一组都会得到偏科答案：</w:t>
-      </w:r>
-    </w:p>
-    <w:tbl>
-      <w:tblPr>
-        <w:tblStyle w:val="TableGrid"/>
-        <w:tblW w:w="14745" w:type="dxa"/>
-        <w:tblBorders>
-          <w:top w:val="single" w:sz="4" w:space="0" w:color="DADDE3"/>
-          <w:left w:val="single" w:sz="4" w:space="0" w:color="DADDE3"/>
-          <w:bottom w:val="single" w:sz="4" w:space="0" w:color="DADDE3"/>
-          <w:right w:val="single" w:sz="4" w:space="0" w:color="DADDE3"/>
-          <w:insideH w:val="single" w:sz="4" w:space="0" w:color="DADDE3"/>
-          <w:insideV w:val="single" w:sz="4" w:space="0" w:color="DADDE3"/>
-        </w:tblBorders>
-        <w:tblLayout w:type="fixed"/>
-        <w:tblCellMar>
-          <w:top w:w="70" w:type="dxa"/>
-          <w:left w:w="110" w:type="dxa"/>
-          <w:bottom w:w="70" w:type="dxa"/>
-          <w:right w:w="110" w:type="dxa"/>
-        </w:tblCellMar>
-        <w:tblLook w:firstRow="1" w:lastRow="0" w:firstColumn="0" w:lastColumn="0" w:noHBand="0" w:noVBand="0"/>
-      </w:tblPr>
-      <w:tblGrid>
-        <w:gridCol w:w="2600"/>
-        <w:gridCol w:w="5700"/>
-        <w:gridCol w:w="6445"/>
-      </w:tblGrid>
-      <w:tr>
-        <w:trPr>
-          <w:cantSplit/>
-          <w:tblHeader/>
-        </w:trPr>
-        <w:tc>
-          <w:tcPr>
-            <w:tcW w:w="2600" w:type="dxa"/>
-            <w:shd w:val="clear" w:color="auto" w:fill="F2F3F5"/>
-          </w:tcPr>
-          <w:p>
-            <w:pPr>
-              <w:spacing w:before="0" w:after="0"/>
-            </w:pPr>
-            <w:r>
-              <w:rPr>
-                <w:b w:val="1"/>
-                <w:sz w:val="20"/>
-                <w:szCs w:val="20"/>
-              </w:rPr>
-              <w:t xml:space="preserve">看什么</w:t>
-            </w:r>
-          </w:p>
-        </w:tc>
-        <w:tc>
-          <w:tcPr>
-            <w:tcW w:w="5700" w:type="dxa"/>
-            <w:shd w:val="clear" w:color="auto" w:fill="F2F3F5"/>
-          </w:tcPr>
-          <w:p>
-            <w:pPr>
-              <w:spacing w:before="0" w:after="0"/>
-            </w:pPr>
-            <w:r>
-              <w:rPr>
-                <w:b w:val="1"/>
-                <w:sz w:val="20"/>
-                <w:szCs w:val="20"/>
-              </w:rPr>
-              <w:t xml:space="preserve">指标</w:t>
-            </w:r>
-          </w:p>
-        </w:tc>
-        <w:tc>
-          <w:tcPr>
-            <w:tcW w:w="6445" w:type="dxa"/>
-            <w:shd w:val="clear" w:color="auto" w:fill="F2F3F5"/>
-          </w:tcPr>
-          <w:p>
-            <w:pPr>
-              <w:spacing w:before="0" w:after="0"/>
-            </w:pPr>
-            <w:r>
-              <w:rPr>
-                <w:b w:val="1"/>
-                <w:sz w:val="20"/>
-                <w:szCs w:val="20"/>
-              </w:rPr>
-              <w:t xml:space="preserve">要回答的问题</w:t>
-            </w:r>
-          </w:p>
-        </w:tc>
-      </w:tr>
-      <w:tr>
-        <w:trPr>
-          <w:cantSplit/>
-        </w:trPr>
-        <w:tc>
-          <w:tcPr>
-            <w:tcW w:w="2600" w:type="dxa"/>
-          </w:tcPr>
-          <w:p>
-            <w:pPr>
-              <w:spacing w:before="0" w:after="0"/>
-            </w:pPr>
-            <w:r>
-              <w:rPr>
-                <w:b w:val="1"/>
-                <w:sz w:val="20"/>
-                <w:szCs w:val="20"/>
-              </w:rPr>
-              <w:t xml:space="preserve">成本与流量</w:t>
-            </w:r>
-          </w:p>
-        </w:tc>
-        <w:tc>
-          <w:tcPr>
-            <w:tcW w:w="5700" w:type="dxa"/>
-          </w:tcPr>
-          <w:p>
-            <w:pPr>
-              <w:spacing w:before="0" w:after="0"/>
-            </w:pPr>
-            <w:r>
-              <w:rPr>
-                <w:sz w:val="20"/>
-                <w:szCs w:val="20"/>
-              </w:rPr>
-              <w:t xml:space="preserve">三本 Token 账、云端账单节省</w:t>
-            </w:r>
-          </w:p>
-        </w:tc>
-        <w:tc>
-          <w:tcPr>
-            <w:tcW w:w="6445" w:type="dxa"/>
-          </w:tcPr>
-          <w:p>
-            <w:pPr>
-              <w:spacing w:before="0" w:after="0"/>
-            </w:pPr>
-            <w:r>
-              <w:rPr>
-                <w:sz w:val="20"/>
-                <w:szCs w:val="20"/>
-              </w:rPr>
-              <w:t xml:space="preserve">到底是计算搬家了，还是云端账单真的降了？</w:t>
-            </w:r>
-          </w:p>
-        </w:tc>
-      </w:tr>
-      <w:tr>
-        <w:trPr>
-          <w:cantSplit/>
-        </w:trPr>
-        <w:tc>
-          <w:tcPr>
-            <w:tcW w:w="2600" w:type="dxa"/>
-          </w:tcPr>
-          <w:p>
-            <w:pPr>
-              <w:spacing w:before="0" w:after="0"/>
-            </w:pPr>
-            <w:r>
-              <w:rPr>
-                <w:b w:val="1"/>
-                <w:sz w:val="20"/>
-                <w:szCs w:val="20"/>
-              </w:rPr>
-              <w:t xml:space="preserve">任务质量</w:t>
-            </w:r>
-          </w:p>
-        </w:tc>
-        <w:tc>
-          <w:tcPr>
-            <w:tcW w:w="5700" w:type="dxa"/>
-          </w:tcPr>
-          <w:p>
-            <w:pPr>
-              <w:spacing w:before="0" w:after="0"/>
-            </w:pPr>
-            <w:r>
-              <w:rPr>
-                <w:sz w:val="20"/>
-                <w:szCs w:val="20"/>
-              </w:rPr>
-              <w:t xml:space="preserve">任务成功率、准确率差值</w:t>
-            </w:r>
-          </w:p>
-        </w:tc>
-        <w:tc>
-          <w:tcPr>
-            <w:tcW w:w="6445" w:type="dxa"/>
-          </w:tcPr>
-          <w:p>
-            <w:pPr>
-              <w:spacing w:before="0" w:after="0"/>
-            </w:pPr>
-            <w:r>
-              <w:rPr>
-                <w:sz w:val="20"/>
-                <w:szCs w:val="20"/>
-              </w:rPr>
-              <w:t xml:space="preserve">省钱是不是拿不可接受的质量下降换的？</w:t>
-            </w:r>
-          </w:p>
-        </w:tc>
-      </w:tr>
-      <w:tr>
-        <w:trPr>
-          <w:cantSplit/>
-        </w:trPr>
-        <w:tc>
-          <w:tcPr>
-            <w:tcW w:w="2600" w:type="dxa"/>
-          </w:tcPr>
-          <w:p>
-            <w:pPr>
-              <w:spacing w:before="0" w:after="0"/>
-            </w:pPr>
-            <w:r>
-              <w:rPr>
-                <w:b w:val="1"/>
-                <w:sz w:val="20"/>
-                <w:szCs w:val="20"/>
-              </w:rPr>
-              <w:t xml:space="preserve">隐私安全</w:t>
-            </w:r>
-          </w:p>
-        </w:tc>
-        <w:tc>
-          <w:tcPr>
-            <w:tcW w:w="5700" w:type="dxa"/>
-          </w:tcPr>
-          <w:p>
-            <w:pPr>
-              <w:spacing w:before="0" w:after="0"/>
-            </w:pPr>
-            <w:r>
-              <w:rPr>
-                <w:sz w:val="20"/>
-                <w:szCs w:val="20"/>
-              </w:rPr>
-              <w:t xml:space="preserve">隐私召回率、用户驳回率、误拦截率</w:t>
-            </w:r>
-          </w:p>
-        </w:tc>
-        <w:tc>
-          <w:tcPr>
-            <w:tcW w:w="6445" w:type="dxa"/>
-          </w:tcPr>
-          <w:p>
-            <w:pPr>
-              <w:spacing w:before="0" w:after="0"/>
-            </w:pPr>
-            <w:r>
-              <w:rPr>
-                <w:sz w:val="20"/>
-                <w:szCs w:val="20"/>
-              </w:rPr>
-              <w:t xml:space="preserve">该拦的拦住没有，不该拦的有没有过度阻断？</w:t>
-            </w:r>
-          </w:p>
-        </w:tc>
-      </w:tr>
-      <w:tr>
-        <w:trPr>
-          <w:cantSplit/>
-        </w:trPr>
-        <w:tc>
-          <w:tcPr>
-            <w:tcW w:w="2600" w:type="dxa"/>
-          </w:tcPr>
-          <w:p>
-            <w:pPr>
-              <w:spacing w:before="0" w:after="0"/>
-            </w:pPr>
-            <w:r>
-              <w:rPr>
-                <w:b w:val="1"/>
-                <w:sz w:val="20"/>
-                <w:szCs w:val="20"/>
-              </w:rPr>
-              <w:t xml:space="preserve">使用体验</w:t>
-            </w:r>
-          </w:p>
-        </w:tc>
-        <w:tc>
-          <w:tcPr>
-            <w:tcW w:w="5700" w:type="dxa"/>
-          </w:tcPr>
-          <w:p>
-            <w:pPr>
-              <w:spacing w:before="0" w:after="0"/>
-            </w:pPr>
-            <w:r>
-              <w:rPr>
-                <w:sz w:val="20"/>
-                <w:szCs w:val="20"/>
-              </w:rPr>
-              <w:t xml:space="preserve">全链路延迟</w:t>
-            </w:r>
-          </w:p>
-        </w:tc>
-        <w:tc>
-          <w:tcPr>
-            <w:tcW w:w="6445" w:type="dxa"/>
-          </w:tcPr>
-          <w:p>
-            <w:pPr>
-              <w:spacing w:before="0" w:after="0"/>
-            </w:pPr>
-            <w:r>
-              <w:rPr>
-                <w:sz w:val="20"/>
-                <w:szCs w:val="20"/>
-              </w:rPr>
-              <w:t xml:space="preserve">路由、审查、批准、上云叠在一起，还能不能用？</w:t>
-            </w:r>
-          </w:p>
-        </w:tc>
-      </w:tr>
-    </w:tbl>
-    <w:p>
-      <w:pPr>
-        <w:spacing w:before="0" w:after="0"/>
-        <w:rPr>
-          <w:sz w:val="8"/>
-        </w:rPr>
-      </w:pPr>
-    </w:p>
-    <w:p>
       <w:pPr>
         <w:pBdr>
           <w:top w:val="single" w:sz="6" w:space="1" w:color="E3E5E8"/>
@@ -3230,14 +2714,14 @@
       </w:pPr>
     </w:p>
     <w:p>
-      <w:bookmarkStart w:id="116" w:name="_h116"/>
+      <w:bookmarkStart w:id="114" w:name="_h114"/>
       <w:pPr>
         <w:pStyle w:val="dingding-heading2"/>
       </w:pPr>
       <w:r>
         <w:t xml:space="preserve">结论：让云端更贵重，而不是更常驻</w:t>
       </w:r>
-      <w:bookmarkEnd w:id="116"/>
+      <w:bookmarkEnd w:id="114"/>
     </w:p>
     <w:p>
       <w:pPr>
@@ -3260,7 +2744,7 @@
         <w:spacing w:before="0" w:after="160"/>
       </w:pPr>
       <w:r>
-        <w:t xml:space="preserve">对技术决策者来说，稳妥的起点不是先喊「省 80%」，而是先立统一的评测框架和三本 Token 账，再按阶段上路由、隐私网关和隔离子代理。最终要证明的不是「本地模型很强」，而是：</w:t>
+        <w:t xml:space="preserve">对技术决策者来说，稳妥的起点不是先喊「省 80%」，而是先立统一的评测框架和三本 Token 账，把门守住之后再一步步放大本地的比例。最终要证明的不是「本地模型很强」，而是：</w:t>
       </w:r>
       <w:r>
         <w:rPr>
@@ -3278,14 +2762,14 @@
       </w:pPr>
     </w:p>
     <w:p>
-      <w:bookmarkStart w:id="117" w:name="_h117"/>
+      <w:bookmarkStart w:id="115" w:name="_h115"/>
       <w:pPr>
         <w:pStyle w:val="dingding-heading2"/>
       </w:pPr>
       <w:r>
         <w:t xml:space="preserve">附一：分场景完整数据</w:t>
       </w:r>
-      <w:bookmarkEnd w:id="117"/>
+      <w:bookmarkEnd w:id="115"/>
     </w:p>
     <w:p>
       <w:pPr>
@@ -4774,14 +4258,14 @@
       </w:r>
     </w:p>
     <w:p>
-      <w:bookmarkStart w:id="118" w:name="_h118"/>
+      <w:bookmarkStart w:id="116" w:name="_h116"/>
       <w:pPr>
         <w:pStyle w:val="dingding-heading2"/>
       </w:pPr>
       <w:r>
         <w:t xml:space="preserve">附二：数据来源</w:t>
       </w:r>
-      <w:bookmarkEnd w:id="118"/>
+      <w:bookmarkEnd w:id="116"/>
     </w:p>
     <w:p>
       <w:pPr>
@@ -4795,7 +4279,7 @@
       <w:pPr>
         <w:numPr>
           <w:ilvl w:val="0"/>
-          <w:numId w:val="6"/>
+          <w:numId w:val="5"/>
         </w:numPr>
         <w:spacing w:before="0" w:after="80"/>
       </w:pPr>
@@ -4815,7 +4299,7 @@
       <w:pPr>
         <w:numPr>
           <w:ilvl w:val="0"/>
-          <w:numId w:val="6"/>
+          <w:numId w:val="5"/>
         </w:numPr>
         <w:spacing w:before="0" w:after="80"/>
       </w:pPr>
@@ -4835,7 +4319,7 @@
       <w:pPr>
         <w:numPr>
           <w:ilvl w:val="0"/>
-          <w:numId w:val="6"/>
+          <w:numId w:val="5"/>
         </w:numPr>
         <w:spacing w:before="0" w:after="80"/>
       </w:pPr>
@@ -4855,7 +4339,7 @@
       <w:pPr>
         <w:numPr>
           <w:ilvl w:val="0"/>
-          <w:numId w:val="6"/>
+          <w:numId w:val="5"/>
         </w:numPr>
         <w:spacing w:before="0" w:after="80"/>
       </w:pPr>
@@ -4875,7 +4359,7 @@
       <w:pPr>
         <w:numPr>
           <w:ilvl w:val="0"/>
-          <w:numId w:val="6"/>
+          <w:numId w:val="5"/>
         </w:numPr>
         <w:spacing w:before="0" w:after="80"/>
       </w:pPr>
@@ -4901,14 +4385,14 @@
         <w:spacing w:before="0" w:after="160"/>
       </w:pPr>
       <w:r>
-        <w:t xml:space="preserve">第三章的参考架构与第二章的官方口径对照：</w:t>
+        <w:t xml:space="preserve">第三章提到的业界方案与第二章的官方口径对照：</w:t>
       </w:r>
     </w:p>
     <w:p>
       <w:pPr>
         <w:numPr>
           <w:ilvl w:val="0"/>
-          <w:numId w:val="7"/>
+          <w:numId w:val="6"/>
         </w:numPr>
         <w:spacing w:before="0" w:after="80"/>
       </w:pPr>
@@ -4953,7 +4437,7 @@
       <w:pPr>
         <w:numPr>
           <w:ilvl w:val="0"/>
-          <w:numId w:val="7"/>
+          <w:numId w:val="6"/>
         </w:numPr>
         <w:spacing w:before="0" w:after="80"/>
       </w:pPr>
@@ -4980,7 +4464,7 @@
       <w:pPr>
         <w:numPr>
           <w:ilvl w:val="0"/>
-          <w:numId w:val="7"/>
+          <w:numId w:val="6"/>
         </w:numPr>
         <w:spacing w:before="0" w:after="80"/>
       </w:pPr>
@@ -5025,7 +4509,7 @@
       <w:pPr>
         <w:numPr>
           <w:ilvl w:val="0"/>
-          <w:numId w:val="7"/>
+          <w:numId w:val="6"/>
         </w:numPr>
         <w:spacing w:before="0" w:after="80"/>
       </w:pPr>
@@ -5104,9 +4588,6 @@
     <w:abstractNumId w:val="1"/>
   </w:num>
   <w:num w:numId="6">
-    <w:abstractNumId w:val="1"/>
-  </w:num>
-  <w:num w:numId="7">
     <w:abstractNumId w:val="1"/>
   </w:num>
 </w:numbering>

</xml_diff>